<commit_message>
Header and review note in plan.md and the CSM draft; Expedia re-rendered
Both documents now open with "Generated automatically from public information; not
validated with the company; the CSM reviews and edits before use." followed by a review
note from data/<company>/inputs/review_note.txt (default: "No human has reviewed this
output."). Schema: metadata.notice takes the new text and metadata.review_note is added.
The CSM draft banner uses the same line. data/expedia/inputs/review_note.txt records what
was checked for the sample; the sample is re-rendered from its committed stage outputs
(no model call).

Co-Authored-By: Claude Opus 5.5 <noreply@anthropic.com>
</commit_message>
<xml_diff>
--- a/output/expedia/csm_draft.docx
+++ b/output/expedia/csm_draft.docx
@@ -25,7 +25,17 @@
           <w:b/>
           <w:i/>
         </w:rPr>
-        <w:t>Draft hypothesis from public information. Not reviewed by a human. For CSM review.</w:t>
+        <w:t>Generated automatically from public information; not validated with the company; the CSM reviews and edits before use.</w:t>
+      </w:r>
+    </w:p>
+    <w:p>
+      <w:pPr/>
+      <w:r>
+        <w:rPr>
+          <w:b w:val="0"/>
+          <w:i/>
+        </w:rPr>
+        <w:t>Review: Extraction read in full by the author (see docs/evaluation.md); Map, Draft and this document were not checked sentence by sentence.</w:t>
       </w:r>
     </w:p>
     <w:p>

</xml_diff>